<commit_message>
Resumo de atividade — 28 de setembro de 2026
</commit_message>
<xml_diff>
--- a/Resumo_atividade/Resumo_atividade_SurveyOS_20260928.docx
+++ b/Resumo_atividade/Resumo_atividade_SurveyOS_20260928.docx
@@ -96,7 +96,7 @@
                 <w:sz w:val="24"/>
                 <w:szCs w:val="24"/>
               </w:rPr>
-              <w:t xml:space="preserve">Das 514 ordens avaliadas, 471 foram encerradas. PR concluiu 361 das 393 abertas na região; SP concluiu 76 das 85 abertas na região; MG concluiu 34 das 36 abertas na região. Todas as regiões têm técnico atribuído em ao menos uma ordem.</w:t>
+              <w:t xml:space="preserve">Das 514 ordens avaliadas, 472 foram encerradas. PR concluiu 362 das 393 abertas na região; SP concluiu 76 das 85 abertas na região; MG concluiu 34 das 36 abertas na região. Todas as regiões têm técnico atribuído em ao menos uma ordem.</w:t>
             </w:r>
           </w:p>
         </w:tc>
@@ -205,7 +205,7 @@
                 <w:sz w:val="44"/>
                 <w:szCs w:val="44"/>
               </w:rPr>
-              <w:t xml:space="preserve">471</w:t>
+              <w:t xml:space="preserve">472</w:t>
             </w:r>
           </w:p>
           <w:p>
@@ -361,7 +361,7 @@
           <w:sz w:val="20"/>
           <w:szCs w:val="20"/>
         </w:rPr>
-        <w:t xml:space="preserve">PR tem técnico atribuído em 393 das 393 ordens, com 361 encerradas. SP tem técnico atribuído em 85 das 85 ordens, com 76 encerradas. MG tem técnico atribuído em 36 das 36 ordens, com 34 encerradas.</w:t>
+        <w:t xml:space="preserve">PR tem técnico atribuído em 393 das 393 ordens, com 362 encerradas. SP tem técnico atribuído em 85 das 85 ordens, com 76 encerradas. MG tem técnico atribuído em 36 das 36 ordens, com 34 encerradas.</w:t>
       </w:r>
     </w:p>
     <w:tbl>
@@ -988,7 +988,7 @@
                 <w:sz w:val="24"/>
                 <w:szCs w:val="24"/>
               </w:rPr>
-              <w:t xml:space="preserve">361</w:t>
+              <w:t xml:space="preserve">362</w:t>
             </w:r>
           </w:p>
         </w:tc>

</xml_diff>